<commit_message>
Simplify resume and professional profile language
</commit_message>
<xml_diff>
--- a/resume/tim-beauchamp-professional-profile.docx
+++ b/resume/tim-beauchamp-professional-profile.docx
@@ -30,17 +30,17 @@
         <w:pStyle w:val="Heading1"/>
       </w:pPr>
       <w:r>
-        <w:t>Engineering Leadership with Technical Depth</w:t>
+        <w:t>Engineering and Management</w:t>
       </w:r>
     </w:p>
     <w:p>
       <w:r>
-        <w:t>Tim Beauchamp is an engineering manager, developer, and inventor with a 35-year software career, including more than 22 years at Adobe. He leads engineers building both AI and traditional software across native desktop, mobile, and complex web applications. His work combines people leadership, practical AI adoption, and hands-on investigation of the systems behind creative products.</w:t>
+        <w:t>Tim Beauchamp manages software engineers at Adobe and still likes getting into the technical details himself. His 35-year software career includes more than 22 years at Adobe, working on native desktop and mobile applications and complex web software. These days, much of his work involves AI: building it into products, using it to develop and test software, and helping his team decide where it is useful and where it needs closer review.</w:t>
       </w:r>
     </w:p>
     <w:p>
       <w:r>
-        <w:t>He is interested in opportunities and partnerships in interoperable, distributed data communication, particularly where resilient applications, distributed sensing, telemetry, and product engineering can turn emerging capabilities into useful systems. His background offers a foundation through communications software, distributed processing, and integration across devices and cloud services.</w:t>
+        <w:t>His background includes communications software, distributed systems, statistical analysis, and databases. He is interested in work that connects devices and services through interoperable, distributed data communication.</w:t>
       </w:r>
     </w:p>
     <w:p>
@@ -48,22 +48,22 @@
         <w:pStyle w:val="Heading1"/>
       </w:pPr>
       <w:r>
-        <w:t>Leading Teams through AI Adoption</w:t>
+        <w:t>AI in Engineering</w:t>
       </w:r>
     </w:p>
     <w:p>
       <w:r>
-        <w:t>At Adobe, Tim helps teams integrate AI into design, implementation, testing, and deployment. He manages work across established platforms using AI assistance and a newer specification-driven agentic environment. His role includes clarifying intent and ownership, setting review expectations, identifying tooling needs, and helping engineers judge the results.</w:t>
+        <w:t>Tim manages developers who use AI throughout design, development, testing, and deployment. The team works on both established codebases and a newer approach in which specifications direct AI agents. He helps define requirements, review expectations, testing, and ownership, and identifies tools the engineers need to do the work well.</w:t>
       </w:r>
     </w:p>
     <w:p>
       <w:r>
-        <w:t>He introduced a recurring learning forum for engineers adapting to new platforms and agentic development. The forum gives teams a place to share discoveries and problems while continuing delivery. He also asks how engineering quality should be assessed across different development models, grounding adoption in engineering judgment rather than assumptions about generated code.</w:t>
+        <w:t>He started a recurring forum where engineers can share what they are learning about the new platform and agentic development, including what goes wrong. He also asks how the team should assess code quality across these different ways of working.</w:t>
       </w:r>
     </w:p>
     <w:p>
       <w:r>
-        <w:t>Tim applies AI directly to management. His workflows include recurring communication digests, meeting recap analysis, action extraction, planning consistency checks, and retrospective preparation using connected tools. He has also proposed further applications in review-culture analysis and cross-service incident triage; those proposals are distinct from the information workflows already in use.</w:t>
+        <w:t>He uses AI in his own management routine to summarize communications, extract meeting actions, check planning details, and prepare regression retrospectives. He has also proposed using it to examine code-review patterns and trace failures across services.</w:t>
       </w:r>
     </w:p>
     <w:p>
@@ -71,17 +71,17 @@
         <w:pStyle w:val="Heading1"/>
       </w:pPr>
       <w:r>
-        <w:t>People and Organizational Leadership</w:t>
+        <w:t>Leading People and Teams</w:t>
       </w:r>
     </w:p>
     <w:p>
       <w:r>
-        <w:t>Tim supports engineers through clear expectations, specific feedback, career development, and promotion processes. He makes evaluation criteria visible and helps teams navigate shifting responsibilities and product direction. Colleagues have independently recognized his inclusive, respectful, collaborative team culture and the welcome he gives new contributors.</w:t>
+        <w:t>Tim gives engineers clear expectations and direct feedback, supports career growth and promotions, and explains how performance is evaluated. Colleagues have recognized the welcoming, respectful, collaborative culture on his team.</w:t>
       </w:r>
     </w:p>
     <w:p>
       <w:r>
-        <w:t>His coordination spans engineering, Product, Design, quality, service teams, program management, and Legal. He looks for gaps in ownership, support, testing, and release readiness, and organizes innovation activities that give engineers space to explore tools and product ideas together.</w:t>
+        <w:t>He works with product, design, QA, service teams, program management, and legal to resolve ownership and release dependencies. He also organizes innovation weeks where engineers can try tools and product ideas together.</w:t>
       </w:r>
     </w:p>
     <w:p>
@@ -98,17 +98,17 @@
         <w:pStyle w:val="Heading1"/>
       </w:pPr>
       <w:r>
-        <w:t>Content Provenance from Engineering to Rollout</w:t>
+        <w:t>Content Credentials</w:t>
       </w:r>
     </w:p>
     <w:p>
       <w:r>
-        <w:t>One of Tim’s clearest delivery examples is Content Credentials in a web-native video editor. He brought together client, media-service, export, testing, program, legal, and communications workstreams through rollout to all users in August 2026. His manager explicitly recognized his leadership in pulling the work together, alongside the implementation contributions of the engineering teams.</w:t>
+        <w:t>Tim coordinated Content Credentials delivery in a web-native video editor through rollout to all users in August 2026. The work involved client software, media services, export, testing, program management, legal, and communications. His manager recognized him for bringing the work together across those teams.</w:t>
       </w:r>
     </w:p>
     <w:p>
       <w:r>
-        <w:t>This work connects technical integration with operational and product requirements. Media provenance involves input metadata, propagation, validation, and output signing, as well as decisions about ownership and failure behavior. Tim’s contribution was coordinating those dependencies into a releasable capability.</w:t>
+        <w:t>The feature required media metadata to survive ingest and editing and reach the signed output. Tim helped coordinate the engineering, testing, and release decisions needed to deliver it.</w:t>
       </w:r>
     </w:p>
     <w:p>
@@ -116,17 +116,17 @@
         <w:pStyle w:val="Heading1"/>
       </w:pPr>
       <w:r>
-        <w:t>Performance Investigation and Practical Toolmaking</w:t>
+        <w:t>Performance Analysis and Tools</w:t>
       </w:r>
     </w:p>
     <w:p>
       <w:r>
-        <w:t>Tim uses Splunk, Python, and AI-assisted analysis to investigate media-processing behavior. His work separates workload characteristics from processing efficiency and examines queue contention, concurrency, cache behavior, and request overhead. An ingest investigation identified an anomalous workload during a saturation event; a separate upload investigation exposed throttling and registration delays even when blocks were cached.</w:t>
+        <w:t>Tim investigates media performance with Splunk, Python, and AI assistance. He examines the difference between expensive processing and time spent waiting on queues, networks, or services. His investigations have identified unusual workloads during an ingest saturation event and upload delays caused by throttling and registration overhead even when file blocks were cached.</w:t>
       </w:r>
     </w:p>
     <w:p>
       <w:r>
-        <w:t>He complements analysis with tools for repeatable experiments. He wrote a Python/FFmpeg generator for configurable test media and built an internal blind listening-comparison service for audio time-stretch evaluation. These examples show his approach to technical decisions: define the question, make the behavior observable, and seek review of assumptions and conclusions.</w:t>
+        <w:t>He also builds tools to test those questions. Examples include a Python/FFmpeg generator for repeatable test media and an internal service for blind comparisons of audio time-stretch algorithms.</w:t>
       </w:r>
     </w:p>
     <w:p>
@@ -134,17 +134,17 @@
         <w:pStyle w:val="Heading1"/>
       </w:pPr>
       <w:r>
-        <w:t>Creative Products and AI Workflows</w:t>
+        <w:t>Video Software and AI Integration</w:t>
       </w:r>
     </w:p>
     <w:p>
       <w:r>
-        <w:t>His Adobe experience includes a multi-platform mobile and desktop video editor, a mobile video-editing SDK, and a web-native video editor. He has managed cross-platform delivery, supported app-store and cloud release processes, diagnosed native build problems, and helped teams move into unfamiliar platforms. His contribution to the web-native video editor public beta includes team preparation leading into the milestone.</w:t>
+        <w:t>His Adobe work includes a mobile and desktop video editor, an iOS and Android editing SDK, and a web-native video editor. He has managed releases through app stores and cloud services, diagnosed native build problems, and helped prepare the web editor team for public beta.</w:t>
       </w:r>
     </w:p>
     <w:p>
       <w:r>
-        <w:t>Recent technical direction includes generative-media execution and preview tradeoffs, asset movement and permissions, and the relationship between playback and export. He proposed reusable editing timelines as graph operations and is involved in connecting AI tools and generative AI artifacts to traditional software through MCP. These activities combine design contribution and experimentation, with proposals kept distinct from shipped features.</w:t>
+        <w:t>He contributes to decisions about generated-media previews, model execution, asset permissions, and playback and export. He proposed reusable timelines as operations in a graph-based workflow and is involved in connecting AI tools and generative AI artifacts to traditional software through MCP.</w:t>
       </w:r>
     </w:p>
     <w:p>
@@ -153,7 +153,7 @@
         <w:pageBreakBefore/>
       </w:pPr>
       <w:r>
-        <w:t>Communications Invention and Independent Engineering</w:t>
+        <w:t>Communications and Independent Projects</w:t>
       </w:r>
     </w:p>
     <w:p>
@@ -161,17 +161,17 @@
         <w:pStyle w:val="Heading1"/>
       </w:pPr>
       <w:r>
-        <w:t>A Foundation in Communications and Data Systems</w:t>
+        <w:t>Earlier Work and Patents</w:t>
       </w:r>
     </w:p>
     <w:p>
       <w:r>
-        <w:t>Before Adobe, Tim’s career included founding and development work at Istante Software, acquired by Oracle; browser development at AOL–Netscape; statistical analysis software at Data Digest; data warehousing at Sagent; and TCP/IP and Internet applications at NetManage. His broader technical experience includes Bayesian analysis and modeling, document classification, database systems, and 3D modeling and rendering.</w:t>
+        <w:t>Before Adobe, Tim was a founder and developer at Istante Software, which Oracle acquired. He also worked on browsers at AOL-Netscape, statistical software at Data Digest, data warehousing at Sagent, and TCP/IP and Internet applications at NetManage. His experience includes Bayesian analysis and modeling, document classification, database systems, and 3D modeling and rendering.</w:t>
       </w:r>
     </w:p>
     <w:p>
       <w:r>
-        <w:t>He is a named co-inventor on 12 granted US software patents spanning real-time enterprise intelligence, event-driven collaboration, resilient networked applications, and adaptive user interfaces. Developed at Iteration/Istante Software and assigned to Oracle, these inventions reflect experience with application continuity, collaborative software, and distributed data processing. Selected grants include US 7,941,542 B2, US 8,402,095 B2, and US 8,001,185 B2.</w:t>
+        <w:t>He is a named co-inventor on 12 granted U.S. software patents covering real-time enterprise intelligence, event-driven collaboration, resilient networked applications, and adaptive user interfaces. The work originated at Iteration/Istante Software, and the grants were assigned to Oracle. Examples include maintaining application execution across intermittent connections, messaging collaboration, and distributed rule evaluation.</w:t>
       </w:r>
     </w:p>
     <w:p>
@@ -179,22 +179,22 @@
         <w:pStyle w:val="Heading1"/>
       </w:pPr>
       <w:r>
-        <w:t>Independent Projects Connecting Devices and Services</w:t>
+        <w:t>Independent Engineering</w:t>
       </w:r>
     </w:p>
     <w:p>
       <w:r>
-        <w:t>Project Phaethon combines camera observations, irradiance sensing, cloud ingestion, archived data, and operational dashboards in an edge-to-cloud proof of concept. Tim’s work includes Python/FastAPI services and evaluation of alerts against sensor observations. Forecasting effectiveness remains under evaluation.</w:t>
+        <w:t>Project Phaethon uses camera observations and irradiance sensors to study near-term changes in solar conditions. Tim built cloud ingestion, data storage, dashboards, and Python/FastAPI services, along with tools to compare alerts against sensor observations. Nowcasting performance is still being evaluated.</w:t>
       </w:r>
     </w:p>
     <w:p>
       <w:r>
-        <w:t>WhatPlaneIsThat brings together ADS-B data services, device location and orientation, geographic calculations, and aircraft overlays in mobile applications. Related work includes OpenDroneID message parsing and libraries for orientation and celestial coordinates. Network Wires extends his practical integration work across sensor firmware, AWS services, databases, and mobile and web interfaces.</w:t>
+        <w:t>His WhatPlaneIsThat mobile applications combine ADS-B data, device location and orientation, and geographic calculations to identify aircraft in the camera view. Related work includes OpenDroneID parsing and coordinate-conversion libraries. Network Wires connects sensor firmware to AWS services, databases, and mobile and web interfaces.</w:t>
       </w:r>
     </w:p>
     <w:p>
       <w:r>
-        <w:t>His local AI and automation projects include a task-routing gateway that reports capability maturity, timing, errors, and uncertainty, plus home automation software, MQTT, voice services, and telemetry across Linux-based embedded computing hosts. Together, these projects demonstrate continued experimentation across software, hardware prototypes, IoT, and operational instrumentation.</w:t>
+        <w:t>His local AI work includes a gateway that routes tasks and reports timing, errors, uncertainty, and the capabilities available to a client. Other projects connect home automation software, MQTT, voice services, and telemetry on Linux-based embedded computing hosts. He continues to build and test both software and hardware prototypes.</w:t>
       </w:r>
     </w:p>
     <w:p>
@@ -207,12 +207,12 @@
     </w:p>
     <w:p>
       <w:r>
-        <w:t>Tim’s potential contribution lies in leading software teams, developing and integrating applications, making distributed systems observable, and connecting technical exploration with delivery. He brings experience across native and web products, interoperable and distributed data communication, and practical AI use. Possible application areas include space-based communications, real-time and near-real-time environmental monitoring and nowcasting, and remote data and telemetry acquisition, working in collaboration with domain specialists.</w:t>
+        <w:t>Tim is interested in work where his experience in engineering management, application development, distributed systems, and AI can help solve practical problems. Possible areas include space-based communications, real-time and near-real-time environmental monitoring and nowcasting, and remote data and telemetry acquisition. He would bring software and integration experience to teams working with specialists in those fields.</w:t>
       </w:r>
     </w:p>
     <w:p>
       <w:r>
-        <w:t>Tim studied Electronic Engineering at California Polytechnic State University, San Luis Obispo. His earlier experience also includes work as a general maintenance mechanic at the Amundsen–Scott South Pole Station in Antarctica.</w:t>
+        <w:t>Tim studied Electronic Engineering at California Polytechnic State University, San Luis Obispo. His earlier experience also includes work as a general maintenance mechanic at the Amundsen-Scott South Pole Station in Antarctica.</w:t>
       </w:r>
     </w:p>
     <w:sectPr>

</xml_diff>